<commit_message>
Anade motor de priorizacion de inversion
</commit_message>
<xml_diff>
--- a/docs/Memoria_Defensa_TFM_Movilidad_Mallorca.docx
+++ b/docs/Memoria_Defensa_TFM_Movilidad_Mallorca.docx
@@ -588,6 +588,20 @@
         <w:rPr>
           <w:rFonts w:ascii="Times New Roman" w:hAnsi="Times New Roman" w:cs="Times New Roman"/>
         </w:rPr>
+        <w:t>Referencias</w:t>
+      </w:r>
+    </w:p>
+    <w:p>
+      <w:pPr>
+        <w:pStyle w:val="Listaconvietas"/>
+        <w:rPr>
+          <w:rFonts w:ascii="Times New Roman" w:hAnsi="Times New Roman" w:cs="Times New Roman"/>
+        </w:rPr>
+      </w:pPr>
+      <w:r>
+        <w:rPr>
+          <w:rFonts w:ascii="Times New Roman" w:hAnsi="Times New Roman" w:cs="Times New Roman"/>
+        </w:rPr>
         <w:t>Glosario de términos</w:t>
       </w:r>
     </w:p>
@@ -2185,13 +2199,7 @@
           <w:rFonts w:ascii="Times New Roman" w:hAnsi="Times New Roman" w:cs="Times New Roman"/>
           <w:b/>
         </w:rPr>
-        <w:t xml:space="preserve">Dejar preparado, aunque no siempre ejecutado, </w:t>
-      </w:r>
-      <w:r>
-        <w:rPr>
-          <w:rFonts w:ascii="Times New Roman" w:hAnsi="Times New Roman" w:cs="Times New Roman"/>
-        </w:rPr>
-        <w:t>el análisis de sentimiento de usuarios y la generación de narrativas explicativas con IA, condicionados a disponer de un corpus de datos con licencia adecuada.</w:t>
+        <w:t>Incorporar el análisis de sentimiento de usuarios y la generación de narrativas explicativas de las rutas, con las salvaguardas de licencia, privacidad y transparencia que exige cada componente (sección 9).</w:t>
       </w:r>
     </w:p>
     <w:p>
@@ -4199,11 +4207,469 @@
           <w:sz w:val="22"/>
           <w:szCs w:val="22"/>
         </w:rPr>
-        <w:t>Análisis de sensibilidad: ¿el resultado depende de cómo pesemos cada componente?</w:t>
+        <w:t>Composición del TSMAI V9</w:t>
       </w:r>
     </w:p>
     <w:p>
       <w:pPr>
+        <w:spacing w:after="160" w:line="276" w:lineRule="auto"/>
+      </w:pPr>
+      <w:r>
+        <w:rPr>
+          <w:rFonts w:ascii="Times New Roman" w:hAnsi="Times New Roman"/>
+          <w:b w:val="0"/>
+          <w:i w:val="0"/>
+          <w:sz w:val="22"/>
+        </w:rPr>
+        <w:t>El TSMAI V9 es una media ponderada de siete componentes, cada uno normalizado entre 0 y 1, agrupados en tres familias: transporte público (40 %), bicicleta (20 %) y a pie (40 %). Los pesos son decisiones analíticas explícitas y están justificados en el Anexo A.</w:t>
+      </w:r>
+    </w:p>
+    <w:tbl>
+      <w:tblPr>
+        <w:tblStyle w:val="Tablaconcuadrcula"/>
+        <w:tblW w:type="auto" w:w="0"/>
+        <w:tblLayout w:type="fixed"/>
+        <w:tblLook w:firstColumn="1" w:firstRow="1" w:lastColumn="0" w:lastRow="0" w:noHBand="0" w:noVBand="1" w:val="04A0"/>
+      </w:tblPr>
+      <w:tblGrid>
+        <w:gridCol w:w="3137"/>
+        <w:gridCol w:w="3137"/>
+        <w:gridCol w:w="3137"/>
+      </w:tblGrid>
+      <w:tr>
+        <w:tc>
+          <w:tcPr>
+            <w:tcW w:type="dxa" w:w="2268"/>
+            <w:vAlign w:val="center"/>
+            <w:shd w:val="clear" w:fill="1F3864"/>
+          </w:tcPr>
+          <w:p>
+            <w:pPr>
+              <w:jc w:val="center"/>
+            </w:pPr>
+            <w:r>
+              <w:rPr>
+                <w:rFonts w:ascii="Times New Roman" w:hAnsi="Times New Roman"/>
+                <w:b/>
+                <w:color w:val="FFFFFF"/>
+                <w:sz w:val="20"/>
+              </w:rPr>
+              <w:t>Familia</w:t>
+            </w:r>
+          </w:p>
+        </w:tc>
+        <w:tc>
+          <w:tcPr>
+            <w:tcW w:type="dxa" w:w="5783"/>
+            <w:vAlign w:val="center"/>
+            <w:shd w:val="clear" w:fill="1F3864"/>
+          </w:tcPr>
+          <w:p>
+            <w:pPr>
+              <w:jc w:val="center"/>
+            </w:pPr>
+            <w:r>
+              <w:rPr>
+                <w:rFonts w:ascii="Times New Roman" w:hAnsi="Times New Roman"/>
+                <w:b/>
+                <w:color w:val="FFFFFF"/>
+                <w:sz w:val="20"/>
+              </w:rPr>
+              <w:t>Componente</w:t>
+            </w:r>
+          </w:p>
+        </w:tc>
+        <w:tc>
+          <w:tcPr>
+            <w:tcW w:type="dxa" w:w="1361"/>
+            <w:vAlign w:val="center"/>
+            <w:shd w:val="clear" w:fill="1F3864"/>
+          </w:tcPr>
+          <w:p>
+            <w:pPr>
+              <w:jc w:val="center"/>
+            </w:pPr>
+            <w:r>
+              <w:rPr>
+                <w:rFonts w:ascii="Times New Roman" w:hAnsi="Times New Roman"/>
+                <w:b/>
+                <w:color w:val="FFFFFF"/>
+                <w:sz w:val="20"/>
+              </w:rPr>
+              <w:t>Peso</w:t>
+            </w:r>
+          </w:p>
+        </w:tc>
+      </w:tr>
+      <w:tr>
+        <w:tc>
+          <w:tcPr>
+            <w:tcW w:type="dxa" w:w="2268"/>
+            <w:vAlign w:val="center"/>
+            <w:shd w:val="clear" w:fill="F2F2F2"/>
+          </w:tcPr>
+          <w:p>
+            <w:r>
+              <w:rPr>
+                <w:rFonts w:ascii="Times New Roman" w:hAnsi="Times New Roman"/>
+                <w:sz w:val="20"/>
+              </w:rPr>
+              <w:t>Transporte público</w:t>
+            </w:r>
+          </w:p>
+        </w:tc>
+        <w:tc>
+          <w:tcPr>
+            <w:tcW w:type="dxa" w:w="5783"/>
+            <w:vAlign w:val="center"/>
+            <w:shd w:val="clear" w:fill="F2F2F2"/>
+          </w:tcPr>
+          <w:p>
+            <w:r>
+              <w:rPr>
+                <w:rFonts w:ascii="Times New Roman" w:hAnsi="Times New Roman"/>
+                <w:sz w:val="20"/>
+              </w:rPr>
+              <w:t>Proximidad a paradas GTFS</w:t>
+            </w:r>
+          </w:p>
+        </w:tc>
+        <w:tc>
+          <w:tcPr>
+            <w:tcW w:type="dxa" w:w="1361"/>
+            <w:vAlign w:val="center"/>
+            <w:shd w:val="clear" w:fill="F2F2F2"/>
+          </w:tcPr>
+          <w:p>
+            <w:r>
+              <w:rPr>
+                <w:rFonts w:ascii="Times New Roman" w:hAnsi="Times New Roman"/>
+                <w:sz w:val="20"/>
+              </w:rPr>
+              <w:t>12 %</w:t>
+            </w:r>
+          </w:p>
+        </w:tc>
+      </w:tr>
+      <w:tr>
+        <w:tc>
+          <w:tcPr>
+            <w:tcW w:type="dxa" w:w="2268"/>
+            <w:vAlign w:val="center"/>
+          </w:tcPr>
+          <w:p>
+            <w:r>
+              <w:rPr>
+                <w:rFonts w:ascii="Times New Roman" w:hAnsi="Times New Roman"/>
+                <w:sz w:val="20"/>
+              </w:rPr>
+              <w:t>Transporte público</w:t>
+            </w:r>
+          </w:p>
+        </w:tc>
+        <w:tc>
+          <w:tcPr>
+            <w:tcW w:type="dxa" w:w="5783"/>
+            <w:vAlign w:val="center"/>
+          </w:tcPr>
+          <w:p>
+            <w:r>
+              <w:rPr>
+                <w:rFonts w:ascii="Times New Roman" w:hAnsi="Times New Roman"/>
+                <w:sz w:val="20"/>
+              </w:rPr>
+              <w:t>Servicio en la parada</w:t>
+            </w:r>
+          </w:p>
+        </w:tc>
+        <w:tc>
+          <w:tcPr>
+            <w:tcW w:type="dxa" w:w="1361"/>
+            <w:vAlign w:val="center"/>
+          </w:tcPr>
+          <w:p>
+            <w:r>
+              <w:rPr>
+                <w:rFonts w:ascii="Times New Roman" w:hAnsi="Times New Roman"/>
+                <w:sz w:val="20"/>
+              </w:rPr>
+              <w:t>8 %</w:t>
+            </w:r>
+          </w:p>
+        </w:tc>
+      </w:tr>
+      <w:tr>
+        <w:tc>
+          <w:tcPr>
+            <w:tcW w:type="dxa" w:w="2268"/>
+            <w:vAlign w:val="center"/>
+            <w:shd w:val="clear" w:fill="F2F2F2"/>
+          </w:tcPr>
+          <w:p>
+            <w:r>
+              <w:rPr>
+                <w:rFonts w:ascii="Times New Roman" w:hAnsi="Times New Roman"/>
+                <w:sz w:val="20"/>
+              </w:rPr>
+              <w:t>Transporte público</w:t>
+            </w:r>
+          </w:p>
+        </w:tc>
+        <w:tc>
+          <w:tcPr>
+            <w:tcW w:type="dxa" w:w="5783"/>
+            <w:vAlign w:val="center"/>
+            <w:shd w:val="clear" w:fill="F2F2F2"/>
+          </w:tcPr>
+          <w:p>
+            <w:r>
+              <w:rPr>
+                <w:rFonts w:ascii="Times New Roman" w:hAnsi="Times New Roman"/>
+                <w:sz w:val="20"/>
+              </w:rPr>
+              <w:t>Conexión real a destinos (media de verano e invierno, cuatro horarios cada una)</w:t>
+            </w:r>
+          </w:p>
+        </w:tc>
+        <w:tc>
+          <w:tcPr>
+            <w:tcW w:type="dxa" w:w="1361"/>
+            <w:vAlign w:val="center"/>
+            <w:shd w:val="clear" w:fill="F2F2F2"/>
+          </w:tcPr>
+          <w:p>
+            <w:r>
+              <w:rPr>
+                <w:rFonts w:ascii="Times New Roman" w:hAnsi="Times New Roman"/>
+                <w:sz w:val="20"/>
+              </w:rPr>
+              <w:t>20 %</w:t>
+            </w:r>
+          </w:p>
+        </w:tc>
+      </w:tr>
+      <w:tr>
+        <w:tc>
+          <w:tcPr>
+            <w:tcW w:type="dxa" w:w="2268"/>
+            <w:vAlign w:val="center"/>
+          </w:tcPr>
+          <w:p>
+            <w:r>
+              <w:rPr>
+                <w:rFonts w:ascii="Times New Roman" w:hAnsi="Times New Roman"/>
+                <w:sz w:val="20"/>
+              </w:rPr>
+              <w:t>Bicicleta</w:t>
+            </w:r>
+          </w:p>
+        </w:tc>
+        <w:tc>
+          <w:tcPr>
+            <w:tcW w:type="dxa" w:w="5783"/>
+            <w:vAlign w:val="center"/>
+          </w:tcPr>
+          <w:p>
+            <w:r>
+              <w:rPr>
+                <w:rFonts w:ascii="Times New Roman" w:hAnsi="Times New Roman"/>
+                <w:sz w:val="20"/>
+              </w:rPr>
+              <w:t>Proximidad a ciclovías OSM</w:t>
+            </w:r>
+          </w:p>
+        </w:tc>
+        <w:tc>
+          <w:tcPr>
+            <w:tcW w:type="dxa" w:w="1361"/>
+            <w:vAlign w:val="center"/>
+          </w:tcPr>
+          <w:p>
+            <w:r>
+              <w:rPr>
+                <w:rFonts w:ascii="Times New Roman" w:hAnsi="Times New Roman"/>
+                <w:sz w:val="20"/>
+              </w:rPr>
+              <w:t>10 %</w:t>
+            </w:r>
+          </w:p>
+        </w:tc>
+      </w:tr>
+      <w:tr>
+        <w:tc>
+          <w:tcPr>
+            <w:tcW w:type="dxa" w:w="2268"/>
+            <w:vAlign w:val="center"/>
+            <w:shd w:val="clear" w:fill="F2F2F2"/>
+          </w:tcPr>
+          <w:p>
+            <w:r>
+              <w:rPr>
+                <w:rFonts w:ascii="Times New Roman" w:hAnsi="Times New Roman"/>
+                <w:sz w:val="20"/>
+              </w:rPr>
+              <w:t>Bicicleta</w:t>
+            </w:r>
+          </w:p>
+        </w:tc>
+        <w:tc>
+          <w:tcPr>
+            <w:tcW w:type="dxa" w:w="5783"/>
+            <w:vAlign w:val="center"/>
+            <w:shd w:val="clear" w:fill="F2F2F2"/>
+          </w:tcPr>
+          <w:p>
+            <w:r>
+              <w:rPr>
+                <w:rFonts w:ascii="Times New Roman" w:hAnsi="Times New Roman"/>
+                <w:sz w:val="20"/>
+              </w:rPr>
+              <w:t>Ruta ciclista real a destinos (OTP)</w:t>
+            </w:r>
+          </w:p>
+        </w:tc>
+        <w:tc>
+          <w:tcPr>
+            <w:tcW w:type="dxa" w:w="1361"/>
+            <w:vAlign w:val="center"/>
+            <w:shd w:val="clear" w:fill="F2F2F2"/>
+          </w:tcPr>
+          <w:p>
+            <w:r>
+              <w:rPr>
+                <w:rFonts w:ascii="Times New Roman" w:hAnsi="Times New Roman"/>
+                <w:sz w:val="20"/>
+              </w:rPr>
+              <w:t>10 %</w:t>
+            </w:r>
+          </w:p>
+        </w:tc>
+      </w:tr>
+      <w:tr>
+        <w:tc>
+          <w:tcPr>
+            <w:tcW w:type="dxa" w:w="2268"/>
+            <w:vAlign w:val="center"/>
+          </w:tcPr>
+          <w:p>
+            <w:r>
+              <w:rPr>
+                <w:rFonts w:ascii="Times New Roman" w:hAnsi="Times New Roman"/>
+                <w:sz w:val="20"/>
+              </w:rPr>
+              <w:t>A pie</w:t>
+            </w:r>
+          </w:p>
+        </w:tc>
+        <w:tc>
+          <w:tcPr>
+            <w:tcW w:type="dxa" w:w="5783"/>
+            <w:vAlign w:val="center"/>
+          </w:tcPr>
+          <w:p>
+            <w:r>
+              <w:rPr>
+                <w:rFonts w:ascii="Times New Roman" w:hAnsi="Times New Roman"/>
+                <w:sz w:val="20"/>
+              </w:rPr>
+              <w:t>Proximidad a evidencia peatonal OSM</w:t>
+            </w:r>
+          </w:p>
+        </w:tc>
+        <w:tc>
+          <w:tcPr>
+            <w:tcW w:type="dxa" w:w="1361"/>
+            <w:vAlign w:val="center"/>
+          </w:tcPr>
+          <w:p>
+            <w:r>
+              <w:rPr>
+                <w:rFonts w:ascii="Times New Roman" w:hAnsi="Times New Roman"/>
+                <w:sz w:val="20"/>
+              </w:rPr>
+              <w:t>20 %</w:t>
+            </w:r>
+          </w:p>
+        </w:tc>
+      </w:tr>
+      <w:tr>
+        <w:tc>
+          <w:tcPr>
+            <w:tcW w:type="dxa" w:w="2268"/>
+            <w:vAlign w:val="center"/>
+            <w:shd w:val="clear" w:fill="F2F2F2"/>
+          </w:tcPr>
+          <w:p>
+            <w:r>
+              <w:rPr>
+                <w:rFonts w:ascii="Times New Roman" w:hAnsi="Times New Roman"/>
+                <w:sz w:val="20"/>
+              </w:rPr>
+              <w:t>A pie</w:t>
+            </w:r>
+          </w:p>
+        </w:tc>
+        <w:tc>
+          <w:tcPr>
+            <w:tcW w:type="dxa" w:w="5783"/>
+            <w:vAlign w:val="center"/>
+            <w:shd w:val="clear" w:fill="F2F2F2"/>
+          </w:tcPr>
+          <w:p>
+            <w:r>
+              <w:rPr>
+                <w:rFonts w:ascii="Times New Roman" w:hAnsi="Times New Roman"/>
+                <w:sz w:val="20"/>
+              </w:rPr>
+              <w:t>Ruta peatonal real a destinos (OTP)</w:t>
+            </w:r>
+          </w:p>
+        </w:tc>
+        <w:tc>
+          <w:tcPr>
+            <w:tcW w:type="dxa" w:w="1361"/>
+            <w:vAlign w:val="center"/>
+            <w:shd w:val="clear" w:fill="F2F2F2"/>
+          </w:tcPr>
+          <w:p>
+            <w:r>
+              <w:rPr>
+                <w:rFonts w:ascii="Times New Roman" w:hAnsi="Times New Roman"/>
+                <w:sz w:val="20"/>
+              </w:rPr>
+              <w:t>20 %</w:t>
+            </w:r>
+          </w:p>
+        </w:tc>
+      </w:tr>
+    </w:tbl>
+    <w:p>
+      <w:pPr>
+        <w:spacing w:after="80"/>
+      </w:pPr>
+    </w:p>
+    <w:p>
+      <w:pPr>
+        <w:pStyle w:val="Ttulo2"/>
+        <w:rPr>
+          <w:rFonts w:ascii="Times New Roman" w:hAnsi="Times New Roman" w:cs="Times New Roman"/>
+          <w:color w:val="auto"/>
+          <w:sz w:val="22"/>
+          <w:szCs w:val="22"/>
+        </w:rPr>
+      </w:pPr>
+      <w:r>
+        <w:rPr>
+          <w:rFonts w:ascii="Times New Roman" w:hAnsi="Times New Roman" w:cs="Times New Roman"/>
+          <w:color w:val="auto"/>
+          <w:sz w:val="22"/>
+          <w:szCs w:val="22"/>
+        </w:rPr>
+        <w:t>Análisis de sensibilidad: ¿el resultado depende de cómo pesemos cada componente?</w:t>
+      </w:r>
+    </w:p>
+    <w:p>
+      <w:pPr>
         <w:spacing w:after="160"/>
         <w:rPr>
           <w:rFonts w:ascii="Times New Roman" w:hAnsi="Times New Roman" w:cs="Times New Roman"/>
@@ -4213,19 +4679,7 @@
         <w:rPr>
           <w:rFonts w:ascii="Times New Roman" w:hAnsi="Times New Roman" w:cs="Times New Roman"/>
         </w:rPr>
-        <w:t>Una de las críticas más razonables a cualquier índice compuesto es: "¿y si hubierais dado más peso a otro componente</w:t>
-      </w:r>
-      <w:r>
-        <w:rPr>
-          <w:rFonts w:ascii="Times New Roman" w:hAnsi="Times New Roman" w:cs="Times New Roman"/>
-        </w:rPr>
-        <w:t>?". Para responderla, el TSMAI V9 se recalcula con cinco combinaciones distintas de pesos (equilibrada, foco en transporte público estacional, foco en movilidad activa, foco en caminabilidad, foco no-transporte-público). Un alojamiento se considera «priori</w:t>
-      </w:r>
-      <w:r>
-        <w:rPr>
-          <w:rFonts w:ascii="Times New Roman" w:hAnsi="Times New Roman" w:cs="Times New Roman"/>
-        </w:rPr>
-        <w:t>dad de mejora robusta» si mantiene ese nivel en, al menos, cuatro de los cinco escenarios. De los 172 alojamientos en prioridad de mejora, 139 lo son de forma robusta: ese es el subconjunto en el que más sentido tiene concentrar primero la revisión.</w:t>
+        <w:t>Una de las críticas más razonables a cualquier índice compuesto es: "¿y si hubierais dado más peso a otro componente?". Para responderla, el TSMAI V9 se recalcula con cinco combinaciones distintas de pesos (equilibrada, foco en transporte público estacional, foco en movilidad activa, foco en caminabilidad, foco no-transporte-público). Un alojamiento se considera «prioridad de mejora robusta» si mantiene ese nivel en los cinco escenarios. De los 172 alojamientos en prioridad de mejora, 139 lo son de forma robusta: ese es el subconjunto en el que más sentido tiene concentrar primero la revisión.</w:t>
       </w:r>
     </w:p>
     <w:p>
@@ -5701,19 +6155,7 @@
         <w:rPr>
           <w:rFonts w:ascii="Times New Roman" w:hAnsi="Times New Roman" w:cs="Times New Roman"/>
         </w:rPr>
-        <w:t xml:space="preserve">Uno de los resultados más </w:t>
-      </w:r>
-      <w:r>
-        <w:rPr>
-          <w:rFonts w:ascii="Times New Roman" w:hAnsi="Times New Roman" w:cs="Times New Roman"/>
-        </w:rPr>
-        <w:t>relevantes del proyecto: probando los mismos cuatro horarios de autobús por alojamiento en verano y en invierno, la conexión encontrada baja del 51 % de los horarios en verano a apenas el 1 % en invierno. Esto no significa que Mallorca se quede sin transpo</w:t>
-      </w:r>
-      <w:r>
-        <w:rPr>
-          <w:rFonts w:ascii="Times New Roman" w:hAnsi="Times New Roman" w:cs="Times New Roman"/>
-        </w:rPr>
-        <w:t>rte público en invierno, sino que, en los horarios muestreados, apenas se encontró servicio — un patrón coherente con la reducción de frecuencias habitual en temporada baja, y que afecta a 793 alojamientos (más de la mitad de la muestra).</w:t>
+        <w:t>Uno de los resultados más relevantes del proyecto: probando los mismos cuatro horarios de autobús por alojamiento en verano y en invierno, la conexión encontrada baja del 51 % de los horarios en verano a apenas el 1,5 % en invierno. Esto no significa que Mallorca se quede sin transporte público en invierno, sino que, en los horarios muestreados, apenas se encontró servicio — un patrón coherente con la reducción de frecuencias habitual en temporada baja, y que afecta a 793 alojamientos (más de la mitad de la muestra).</w:t>
       </w:r>
     </w:p>
     <w:p>
@@ -5796,19 +6238,7 @@
         <w:rPr>
           <w:rFonts w:ascii="Times New Roman" w:hAnsi="Times New Roman" w:cs="Times New Roman"/>
         </w:rPr>
-        <w:t>Comparando, para la mues</w:t>
-      </w:r>
-      <w:r>
-        <w:rPr>
-          <w:rFonts w:ascii="Times New Roman" w:hAnsi="Times New Roman" w:cs="Times New Roman"/>
-        </w:rPr>
-        <w:t>tra de validación, la ruta en coche frente a la ruta en autobús calculadas ambas por el motor OTP (con factores de emisión oficiales MITECO 2024), se estima un ahorro de 2.844 kg de CO2 equivalente, una reducción del 69,8 % frente a la alternativa en coche</w:t>
-      </w:r>
-      <w:r>
-        <w:rPr>
-          <w:rFonts w:ascii="Times New Roman" w:hAnsi="Times New Roman" w:cs="Times New Roman"/>
-        </w:rPr>
-        <w:t>, sobre 6 de las 7 rutas comparables de la muestra. Esta cifra es ilustrativa de la muestra analizada, no una proyección de la demanda turística real.</w:t>
+        <w:t>Comparando, para la muestra de validación, la ruta en coche frente a la ruta en autobús calculadas ambas por el motor OTP (con factores de emisión oficiales MITECO 2024), se estima un ahorro acumulado de 2,84 kg de CO₂ equivalente (0,47 kg de media por trayecto), una reducción agregada del 69,8 % frente a la alternativa en coche, sobre 6 de las 7 rutas comparables de la muestra. Esta cifra es ilustrativa de la muestra analizada, no una proyección de la demanda turística real.</w:t>
       </w:r>
     </w:p>
     <w:p>
@@ -5933,246 +6363,6 @@
     </w:p>
     <w:p>
       <w:pPr>
-        <w:rPr>
-          <w:rFonts w:ascii="Times New Roman" w:hAnsi="Times New Roman" w:cs="Times New Roman"/>
-        </w:rPr>
-      </w:pPr>
-      <w:r>
-        <w:rPr>
-          <w:rFonts w:ascii="Times New Roman" w:hAnsi="Times New Roman" w:cs="Times New Roman"/>
-        </w:rPr>
-        <w:lastRenderedPageBreak/>
-        <w:br w:type="page"/>
-      </w:r>
-    </w:p>
-    <w:p>
-      <w:pPr>
-        <w:pStyle w:val="Ttulo1"/>
-      </w:pPr>
-      <w:r>
-        <w:lastRenderedPageBreak/>
-        <w:t>8. Validación, calidad y reproducibilidad</w:t>
-      </w:r>
-    </w:p>
-    <w:p>
-      <w:pPr>
-        <w:spacing w:after="160"/>
-        <w:rPr>
-          <w:rFonts w:ascii="Times New Roman" w:hAnsi="Times New Roman" w:cs="Times New Roman"/>
-        </w:rPr>
-      </w:pPr>
-      <w:r>
-        <w:rPr>
-          <w:rFonts w:ascii="Times New Roman" w:hAnsi="Times New Roman" w:cs="Times New Roman"/>
-        </w:rPr>
-        <w:t>Un proyecto de este tipo solo es defendible si cualquier resultado que se muestre se puede volver a calcular y verificar. Por eso se ha invertido un esfuerzo comparable en la trazabilidad del dato co</w:t>
-      </w:r>
-      <w:r>
-        <w:rPr>
-          <w:rFonts w:ascii="Times New Roman" w:hAnsi="Times New Roman" w:cs="Times New Roman"/>
-        </w:rPr>
-        <w:t>mo en el propio índice.</w:t>
-      </w:r>
-    </w:p>
-    <w:p>
-      <w:pPr>
-        <w:pStyle w:val="Listaconvietas"/>
-        <w:spacing w:after="120"/>
-        <w:rPr>
-          <w:rFonts w:ascii="Times New Roman" w:hAnsi="Times New Roman" w:cs="Times New Roman"/>
-        </w:rPr>
-      </w:pPr>
-      <w:r>
-        <w:rPr>
-          <w:rFonts w:ascii="Times New Roman" w:hAnsi="Times New Roman" w:cs="Times New Roman"/>
-          <w:b/>
-        </w:rPr>
-        <w:t xml:space="preserve">Motor de rutas validado a escala: </w:t>
-      </w:r>
-      <w:r>
-        <w:rPr>
-          <w:rFonts w:ascii="Times New Roman" w:hAnsi="Times New Roman" w:cs="Times New Roman"/>
-        </w:rPr>
-        <w:t>el barrido masivo de rutas OTP alcanza una tasa de éxito del 98,5 % (1.441 de 1.463 pares alojamiento-destino con ruta calculada correctamente).</w:t>
-      </w:r>
-    </w:p>
-    <w:p>
-      <w:pPr>
-        <w:pStyle w:val="Listaconvietas"/>
-        <w:spacing w:after="120"/>
-        <w:rPr>
-          <w:rFonts w:ascii="Times New Roman" w:hAnsi="Times New Roman" w:cs="Times New Roman"/>
-        </w:rPr>
-      </w:pPr>
-      <w:r>
-        <w:rPr>
-          <w:rFonts w:ascii="Times New Roman" w:hAnsi="Times New Roman" w:cs="Times New Roman"/>
-          <w:b/>
-        </w:rPr>
-        <w:t xml:space="preserve">19 pruebas automatizadas (pytest), </w:t>
-      </w:r>
-      <w:r>
-        <w:rPr>
-          <w:rFonts w:ascii="Times New Roman" w:hAnsi="Times New Roman" w:cs="Times New Roman"/>
-        </w:rPr>
-        <w:t>que se ejecutan an</w:t>
-      </w:r>
-      <w:r>
-        <w:rPr>
-          <w:rFonts w:ascii="Times New Roman" w:hAnsi="Times New Roman" w:cs="Times New Roman"/>
-        </w:rPr>
-        <w:t>tes de cualquier cambio y verifican que el sistema sigue calculando lo que dice calcular.</w:t>
-      </w:r>
-    </w:p>
-    <w:p>
-      <w:pPr>
-        <w:pStyle w:val="Listaconvietas"/>
-        <w:spacing w:after="120"/>
-        <w:rPr>
-          <w:rFonts w:ascii="Times New Roman" w:hAnsi="Times New Roman" w:cs="Times New Roman"/>
-        </w:rPr>
-      </w:pPr>
-      <w:r>
-        <w:rPr>
-          <w:rFonts w:ascii="Times New Roman" w:hAnsi="Times New Roman" w:cs="Times New Roman"/>
-          <w:b/>
-        </w:rPr>
-        <w:t xml:space="preserve">49 tareas de procesamiento </w:t>
-      </w:r>
-      <w:r>
-        <w:rPr>
-          <w:rFonts w:ascii="Times New Roman" w:hAnsi="Times New Roman" w:cs="Times New Roman"/>
-        </w:rPr>
-        <w:t>registradas y comprobables con un único comando (`python scripts/run_task.py --check`), que confirma que todo el pipeline puede cargarse si</w:t>
-      </w:r>
-      <w:r>
-        <w:rPr>
-          <w:rFonts w:ascii="Times New Roman" w:hAnsi="Times New Roman" w:cs="Times New Roman"/>
-        </w:rPr>
-        <w:t>n errores antes de ejecutarlo de verdad.</w:t>
-      </w:r>
-    </w:p>
-    <w:p>
-      <w:pPr>
-        <w:pStyle w:val="Listaconvietas"/>
-        <w:spacing w:after="120"/>
-        <w:rPr>
-          <w:rFonts w:ascii="Times New Roman" w:hAnsi="Times New Roman" w:cs="Times New Roman"/>
-        </w:rPr>
-      </w:pPr>
-      <w:r>
-        <w:rPr>
-          <w:rFonts w:ascii="Times New Roman" w:hAnsi="Times New Roman" w:cs="Times New Roman"/>
-          <w:b/>
-        </w:rPr>
-        <w:t xml:space="preserve">Escrituras atómicas y huellas SHA-256: </w:t>
-      </w:r>
-      <w:r>
-        <w:rPr>
-          <w:rFonts w:ascii="Times New Roman" w:hAnsi="Times New Roman" w:cs="Times New Roman"/>
-        </w:rPr>
-        <w:t>los ficheros de resultados se escriben de forma que nunca queda un fichero a medias, y se registra la huella digital del fichero de entrada usado en cada cálculo.</w:t>
-      </w:r>
-    </w:p>
-    <w:p>
-      <w:pPr>
-        <w:pStyle w:val="Listaconvietas"/>
-        <w:spacing w:after="120"/>
-        <w:rPr>
-          <w:rFonts w:ascii="Times New Roman" w:hAnsi="Times New Roman" w:cs="Times New Roman"/>
-        </w:rPr>
-      </w:pPr>
-      <w:r>
-        <w:rPr>
-          <w:rFonts w:ascii="Times New Roman" w:hAnsi="Times New Roman" w:cs="Times New Roman"/>
-          <w:b/>
-        </w:rPr>
-        <w:t xml:space="preserve">Auditoría activa durante el desarrollo: </w:t>
-      </w:r>
-      <w:r>
-        <w:rPr>
-          <w:rFonts w:ascii="Times New Roman" w:hAnsi="Times New Roman" w:cs="Times New Roman"/>
-        </w:rPr>
-        <w:t>en la fase final de revisión se encontraron y corrigieron varios problemas reales antes de la defensa, entre ellos: un mapa que se mostraba con el zoom incorrecto por una condición de carrera al dibujar el componente</w:t>
-      </w:r>
-      <w:r>
-        <w:rPr>
-          <w:rFonts w:ascii="Times New Roman" w:hAnsi="Times New Roman" w:cs="Times New Roman"/>
-        </w:rPr>
-        <w:t>, una métrica del panel ("Prioridades robustas") que por error medía justo lo contrario de lo que decía su etiqueta, y una colisión de nombres internos en el código de análisis que hacía que varias tareas de cálculo escribieran sus resultados en el fichero</w:t>
-      </w:r>
-      <w:r>
-        <w:rPr>
-          <w:rFonts w:ascii="Times New Roman" w:hAnsi="Times New Roman" w:cs="Times New Roman"/>
-        </w:rPr>
-        <w:t xml:space="preserve"> equivocado si se volvían a ejecutar. Los tres quedaron corregidos y verificados antes de este documento.</w:t>
-      </w:r>
-    </w:p>
-    <w:p>
-      <w:pPr>
-        <w:spacing w:after="280"/>
-        <w:rPr>
-          <w:rFonts w:ascii="Times New Roman" w:hAnsi="Times New Roman" w:cs="Times New Roman"/>
-        </w:rPr>
-      </w:pPr>
-      <w:r>
-        <w:rPr>
-          <w:rFonts w:ascii="Times New Roman" w:hAnsi="Times New Roman" w:cs="Times New Roman"/>
-          <w:i/>
-        </w:rPr>
-        <w:t>→ Anexo H — Informes de validación final y reproducibilidad operativa</w:t>
-      </w:r>
-    </w:p>
-    <w:p>
-      <w:pPr>
-        <w:rPr>
-          <w:rFonts w:ascii="Times New Roman" w:hAnsi="Times New Roman" w:cs="Times New Roman"/>
-        </w:rPr>
-      </w:pPr>
-      <w:r>
-        <w:rPr>
-          <w:rFonts w:ascii="Times New Roman" w:hAnsi="Times New Roman" w:cs="Times New Roman"/>
-        </w:rPr>
-        <w:br w:type="page"/>
-      </w:r>
-    </w:p>
-    <w:p>
-      <w:pPr>
-        <w:pStyle w:val="Ttulo1"/>
-      </w:pPr>
-      <w:r>
-        <w:lastRenderedPageBreak/>
-        <w:t>9. Sentimiento de usuarios y accesibilidad universal (alcance ampliado)</w:t>
-      </w:r>
-    </w:p>
-    <w:p>
-      <w:pPr>
-        <w:spacing w:after="160"/>
-        <w:rPr>
-          <w:rFonts w:ascii="Times New Roman" w:hAnsi="Times New Roman" w:cs="Times New Roman"/>
-        </w:rPr>
-      </w:pPr>
-      <w:r>
-        <w:rPr>
-          <w:rFonts w:ascii="Times New Roman" w:hAnsi="Times New Roman" w:cs="Times New Roman"/>
-        </w:rPr>
-        <w:t>El des</w:t>
-      </w:r>
-      <w:r>
-        <w:rPr>
-          <w:rFonts w:ascii="Times New Roman" w:hAnsi="Times New Roman" w:cs="Times New Roman"/>
-        </w:rPr>
-        <w:t>afío original pide también incorporar el sentimiento de los usuarios sobre la movilidad y, en su nivel más avanzado, la accesibilidad universal. Son los dos componentes más delicados del proyecto, porque dependen de datos que no siempre están disponibles c</w:t>
-      </w:r>
-      <w:r>
-        <w:rPr>
-          <w:rFonts w:ascii="Times New Roman" w:hAnsi="Times New Roman" w:cs="Times New Roman"/>
-        </w:rPr>
-        <w:t>on la calidad y la licencia necesarias — y aquí se ha optado deliberadamente por no fabricar un resultado antes que mostrar algo poco fiable.</w:t>
-      </w:r>
-    </w:p>
-    <w:p>
-      <w:pPr>
         <w:pStyle w:val="Ttulo2"/>
         <w:rPr>
           <w:rFonts w:ascii="Times New Roman" w:hAnsi="Times New Roman" w:cs="Times New Roman"/>
@@ -6188,7 +6378,7 @@
           <w:sz w:val="22"/>
           <w:szCs w:val="22"/>
         </w:rPr>
-        <w:t>9.1 Sentimiento de usuarios</w:t>
+        <w:t>7.7 Orden de prioridad de inversión bajo presupuesto limitado</w:t>
       </w:r>
     </w:p>
     <w:p>
@@ -6202,25 +6392,7 @@
         <w:rPr>
           <w:rFonts w:ascii="Times New Roman" w:hAnsi="Times New Roman" w:cs="Times New Roman"/>
         </w:rPr>
-        <w:t xml:space="preserve">El sistema incorpora un modelo de análisis de sentimiento multilingüe (BERT) capaz de </w:t>
-      </w:r>
-      <w:r>
-        <w:rPr>
-          <w:rFonts w:ascii="Times New Roman" w:hAnsi="Times New Roman" w:cs="Times New Roman"/>
-        </w:rPr>
-        <w:t>clasificar reseñas como positivas, neutras o negativas y detectar si mencionan movilidad (autobús, caminar, bicicleta, accesibilidad, tráfico). Durante la fase final del proyecto se incorporó un corpus real de reseñas de Inside Airbnb correspondiente a Mal</w:t>
-      </w:r>
-      <w:r>
-        <w:rPr>
-          <w:rFonts w:ascii="Times New Roman" w:hAnsi="Times New Roman" w:cs="Times New Roman"/>
-        </w:rPr>
-        <w:t>lorca (licencia Creative Commons Atribución 4.0, verificada directamente en la fuente), sobre el que se ha ejecutado el análisis de sentimiento por primera vez con datos reales, en una muestra de 1.530 reseñas (30 por municipio, sobre un total de 397.789 r</w:t>
-      </w:r>
-      <w:r>
-        <w:rPr>
-          <w:rFonts w:ascii="Times New Roman" w:hAnsi="Times New Roman" w:cs="Times New Roman"/>
-        </w:rPr>
-        <w:t>eseñas disponibles vinculadas a un municipio del proyecto).</w:t>
+        <w:t>Los escenarios de mejora de cobertura (7.6 y el análisis de sensibilidad municipal) responden a «¿qué pasaría si se interviene?», pero no a «¿por dónde se empieza si el presupuesto no llega para todo?». Para responder a esa segunda pregunta se implementó una heurística voraz (greedy), equivalente a la relajación fraccionaria de un problema de la mochila (fractional knapsack): ordena los municipios candidatos a intervención de última milla por su valor por unidad de coste, donde el coste es el número de alojamientos candidatos en ese municipio y el valor los pondera por la demanda turística relativa. El panel de control incluye un control interactivo para explorar ese orden con distintos presupuestos.</w:t>
       </w:r>
     </w:p>
     <w:p>
@@ -6234,25 +6406,237 @@
         <w:rPr>
           <w:rFonts w:ascii="Times New Roman" w:hAnsi="Times New Roman" w:cs="Times New Roman"/>
         </w:rPr>
-        <w:t>El resultado se agrega siempre por municipio, nunca se publica el texto de una reseña individual, y solo se muestra una media cuando hay al menos 10 reseñas relevantes de movilidad en ese municipi</w:t>
-      </w:r>
-      <w:r>
-        <w:rPr>
-          <w:rFonts w:ascii="Times New Roman" w:hAnsi="Times New Roman" w:cs="Times New Roman"/>
-        </w:rPr>
-        <w:t>o — para evitar conclusiones inestables sobre muestras pequeñas. Con esta primera muestra de validación, de las 1.530 reseñas analizadas solo 194 (12,7 %) mencionan explícitamente movilidad, y ningún municipio alcanza todavía las 10 menciones necesarias pa</w:t>
-      </w:r>
-      <w:r>
-        <w:rPr>
-          <w:rFonts w:ascii="Times New Roman" w:hAnsi="Times New Roman" w:cs="Times New Roman"/>
-        </w:rPr>
-        <w:t>ra publicar una media (el máximo es 9, en Alaró y Andratx). Es un resultado honesto, no un fallo del sistema: confirma que el pipeline funciona de punta a punta con datos reales, y deja acotado cuánto haría falta ampliar la muestra —del orden de varios mil</w:t>
-      </w:r>
-      <w:r>
-        <w:rPr>
-          <w:rFonts w:ascii="Times New Roman" w:hAnsi="Times New Roman" w:cs="Times New Roman"/>
-        </w:rPr>
-        <w:t>es de reseñas por municipio— para empezar a publicar resultados.</w:t>
+        <w:t>El resultado, sobre los datos actuales: financiar solo Calvià y Palma —2 de los 15 municipios candidatos— ya resuelve 20 de los 42 alojamientos candidatos (47,6 % del esfuerzo) y captura el 60 % del valor ponderado total. Es una diferencia sustancial frente a intervenir en orden alfabético o por tamaño de municipio: la heurística concentra el resultado donde la relación entre alojamientos beneficiados y demanda turística es más alta.</w:t>
+      </w:r>
+    </w:p>
+    <w:p>
+      <w:pPr>
+        <w:spacing w:after="280"/>
+      </w:pPr>
+      <w:r>
+        <w:rPr>
+          <w:rFonts w:ascii="Times New Roman" w:hAnsi="Times New Roman"/>
+          <w:i/>
+          <w:color w:val="2E75B6"/>
+          <w:sz w:val="20"/>
+        </w:rPr>
+        <w:t>→ Anexo F — Recomendaciones de intervención</w:t>
+      </w:r>
+    </w:p>
+    <w:p>
+      <w:pPr>
+        <w:rPr>
+          <w:rFonts w:ascii="Times New Roman" w:hAnsi="Times New Roman" w:cs="Times New Roman"/>
+        </w:rPr>
+      </w:pPr>
+      <w:r>
+        <w:rPr>
+          <w:rFonts w:ascii="Times New Roman" w:hAnsi="Times New Roman" w:cs="Times New Roman"/>
+        </w:rPr>
+        <w:lastRenderedPageBreak/>
+        <w:br w:type="page"/>
+      </w:r>
+    </w:p>
+    <w:p>
+      <w:pPr>
+        <w:pStyle w:val="Ttulo1"/>
+      </w:pPr>
+      <w:r>
+        <w:lastRenderedPageBreak/>
+        <w:t>8. Validación, calidad y reproducibilidad</w:t>
+      </w:r>
+    </w:p>
+    <w:p>
+      <w:pPr>
+        <w:spacing w:after="160"/>
+        <w:rPr>
+          <w:rFonts w:ascii="Times New Roman" w:hAnsi="Times New Roman" w:cs="Times New Roman"/>
+        </w:rPr>
+      </w:pPr>
+      <w:r>
+        <w:rPr>
+          <w:rFonts w:ascii="Times New Roman" w:hAnsi="Times New Roman" w:cs="Times New Roman"/>
+        </w:rPr>
+        <w:t>Un proyecto de este tipo solo es defendible si cualquier resultado que se muestre se puede volver a calcular y verificar. Por eso se ha invertido un esfuerzo comparable en la trazabilidad del dato co</w:t>
+      </w:r>
+      <w:r>
+        <w:rPr>
+          <w:rFonts w:ascii="Times New Roman" w:hAnsi="Times New Roman" w:cs="Times New Roman"/>
+        </w:rPr>
+        <w:t>mo en el propio índice.</w:t>
+      </w:r>
+    </w:p>
+    <w:p>
+      <w:pPr>
+        <w:pStyle w:val="Listaconvietas"/>
+        <w:spacing w:after="120"/>
+        <w:rPr>
+          <w:rFonts w:ascii="Times New Roman" w:hAnsi="Times New Roman" w:cs="Times New Roman"/>
+        </w:rPr>
+      </w:pPr>
+      <w:r>
+        <w:rPr>
+          <w:rFonts w:ascii="Times New Roman" w:hAnsi="Times New Roman" w:cs="Times New Roman"/>
+          <w:b/>
+        </w:rPr>
+        <w:t xml:space="preserve">Motor de rutas validado a escala: </w:t>
+      </w:r>
+      <w:r>
+        <w:rPr>
+          <w:rFonts w:ascii="Times New Roman" w:hAnsi="Times New Roman" w:cs="Times New Roman"/>
+        </w:rPr>
+        <w:t>el barrido masivo de rutas OTP alcanza una tasa de éxito del 98,5 % (1.441 de 1.463 pares alojamiento-destino con ruta calculada correctamente).</w:t>
+      </w:r>
+    </w:p>
+    <w:p>
+      <w:pPr>
+        <w:pStyle w:val="Listaconvietas"/>
+        <w:spacing w:after="120"/>
+        <w:rPr>
+          <w:rFonts w:ascii="Times New Roman" w:hAnsi="Times New Roman" w:cs="Times New Roman"/>
+        </w:rPr>
+      </w:pPr>
+      <w:r>
+        <w:rPr>
+          <w:rFonts w:ascii="Times New Roman" w:hAnsi="Times New Roman" w:cs="Times New Roman"/>
+          <w:b/>
+        </w:rPr>
+        <w:t>21 pruebas automatizadas (pytest), que se ejecutan antes de cualquier cambio y verifican que el sistema sigue calculando lo que dice calcular.</w:t>
+      </w:r>
+    </w:p>
+    <w:p>
+      <w:pPr>
+        <w:pStyle w:val="Listaconvietas"/>
+        <w:spacing w:after="120"/>
+        <w:rPr>
+          <w:rFonts w:ascii="Times New Roman" w:hAnsi="Times New Roman" w:cs="Times New Roman"/>
+        </w:rPr>
+      </w:pPr>
+      <w:r>
+        <w:rPr>
+          <w:rFonts w:ascii="Times New Roman" w:hAnsi="Times New Roman" w:cs="Times New Roman"/>
+          <w:b/>
+        </w:rPr>
+        <w:t>50 tareas de procesamiento registradas y comprobables con un único comando (`python scripts/run_task.py --check`), que confirma que todo el pipeline puede cargarse sin errores antes de ejecutarlo de verdad.</w:t>
+      </w:r>
+    </w:p>
+    <w:p>
+      <w:pPr>
+        <w:pStyle w:val="Listaconvietas"/>
+        <w:spacing w:after="120"/>
+        <w:rPr>
+          <w:rFonts w:ascii="Times New Roman" w:hAnsi="Times New Roman" w:cs="Times New Roman"/>
+        </w:rPr>
+      </w:pPr>
+      <w:r>
+        <w:rPr>
+          <w:rFonts w:ascii="Times New Roman" w:hAnsi="Times New Roman" w:cs="Times New Roman"/>
+          <w:b/>
+        </w:rPr>
+        <w:t xml:space="preserve">Escrituras atómicas y huellas SHA-256: </w:t>
+      </w:r>
+      <w:r>
+        <w:rPr>
+          <w:rFonts w:ascii="Times New Roman" w:hAnsi="Times New Roman" w:cs="Times New Roman"/>
+        </w:rPr>
+        <w:t>los ficheros de resultados se escriben de forma que nunca queda un fichero a medias, y se registra la huella digital del fichero de entrada usado en cada cálculo.</w:t>
+      </w:r>
+    </w:p>
+    <w:p>
+      <w:pPr>
+        <w:pStyle w:val="Listaconvietas"/>
+        <w:spacing w:after="120"/>
+        <w:rPr>
+          <w:rFonts w:ascii="Times New Roman" w:hAnsi="Times New Roman" w:cs="Times New Roman"/>
+        </w:rPr>
+      </w:pPr>
+      <w:r>
+        <w:rPr>
+          <w:rFonts w:ascii="Times New Roman" w:hAnsi="Times New Roman" w:cs="Times New Roman"/>
+          <w:b/>
+        </w:rPr>
+        <w:t xml:space="preserve">Auditoría activa durante el desarrollo: </w:t>
+      </w:r>
+      <w:r>
+        <w:rPr>
+          <w:rFonts w:ascii="Times New Roman" w:hAnsi="Times New Roman" w:cs="Times New Roman"/>
+        </w:rPr>
+        <w:t>en la fase final de revisión se encontraron y corrigieron varios problemas reales antes de la defensa, entre ellos: un mapa que se mostraba con el zoom incorrecto por una condición de carrera al dibujar el componente</w:t>
+      </w:r>
+      <w:r>
+        <w:rPr>
+          <w:rFonts w:ascii="Times New Roman" w:hAnsi="Times New Roman" w:cs="Times New Roman"/>
+        </w:rPr>
+        <w:t>, una métrica del panel ("Prioridades robustas") que por error medía justo lo contrario de lo que decía su etiqueta, y una colisión de nombres internos en el código de análisis que hacía que varias tareas de cálculo escribieran sus resultados en el fichero</w:t>
+      </w:r>
+      <w:r>
+        <w:rPr>
+          <w:rFonts w:ascii="Times New Roman" w:hAnsi="Times New Roman" w:cs="Times New Roman"/>
+        </w:rPr>
+        <w:t xml:space="preserve"> equivocado si se volvían a ejecutar. Los tres quedaron corregidos y verificados antes de este documento.</w:t>
+      </w:r>
+    </w:p>
+    <w:p>
+      <w:pPr>
+        <w:spacing w:after="280"/>
+        <w:rPr>
+          <w:rFonts w:ascii="Times New Roman" w:hAnsi="Times New Roman" w:cs="Times New Roman"/>
+        </w:rPr>
+      </w:pPr>
+      <w:r>
+        <w:rPr>
+          <w:rFonts w:ascii="Times New Roman" w:hAnsi="Times New Roman" w:cs="Times New Roman"/>
+          <w:i/>
+        </w:rPr>
+        <w:t>→ Anexo H — Informes de validación final y reproducibilidad operativa</w:t>
+      </w:r>
+    </w:p>
+    <w:p>
+      <w:pPr>
+        <w:rPr>
+          <w:rFonts w:ascii="Times New Roman" w:hAnsi="Times New Roman" w:cs="Times New Roman"/>
+        </w:rPr>
+      </w:pPr>
+      <w:r>
+        <w:rPr>
+          <w:rFonts w:ascii="Times New Roman" w:hAnsi="Times New Roman" w:cs="Times New Roman"/>
+        </w:rPr>
+        <w:br w:type="page"/>
+      </w:r>
+    </w:p>
+    <w:p>
+      <w:pPr>
+        <w:pStyle w:val="Ttulo1"/>
+      </w:pPr>
+      <w:r>
+        <w:lastRenderedPageBreak/>
+        <w:t>9. Sentimiento de usuarios y accesibilidad universal (alcance ampliado)</w:t>
+      </w:r>
+    </w:p>
+    <w:p>
+      <w:pPr>
+        <w:spacing w:after="160"/>
+        <w:rPr>
+          <w:rFonts w:ascii="Times New Roman" w:hAnsi="Times New Roman" w:cs="Times New Roman"/>
+        </w:rPr>
+      </w:pPr>
+      <w:r>
+        <w:rPr>
+          <w:rFonts w:ascii="Times New Roman" w:hAnsi="Times New Roman" w:cs="Times New Roman"/>
+        </w:rPr>
+        <w:t>El des</w:t>
+      </w:r>
+      <w:r>
+        <w:rPr>
+          <w:rFonts w:ascii="Times New Roman" w:hAnsi="Times New Roman" w:cs="Times New Roman"/>
+        </w:rPr>
+        <w:t>afío original pide también incorporar el sentimiento de los usuarios sobre la movilidad y, en su nivel más avanzado, la accesibilidad universal. Son los dos componentes más delicados del proyecto, porque dependen de datos que no siempre están disponibles c</w:t>
+      </w:r>
+      <w:r>
+        <w:rPr>
+          <w:rFonts w:ascii="Times New Roman" w:hAnsi="Times New Roman" w:cs="Times New Roman"/>
+        </w:rPr>
+        <w:t>on la calidad y la licencia necesarias — y aquí se ha optado deliberadamente por no fabricar un resultado antes que mostrar algo poco fiable.</w:t>
       </w:r>
     </w:p>
     <w:p>
@@ -6272,7 +6656,7 @@
           <w:sz w:val="22"/>
           <w:szCs w:val="22"/>
         </w:rPr>
-        <w:t>9.2 Accesibilidad universal</w:t>
+        <w:t>9.1 Sentimiento de usuarios</w:t>
       </w:r>
     </w:p>
     <w:p>
@@ -6286,51 +6670,197 @@
         <w:rPr>
           <w:rFonts w:ascii="Times New Roman" w:hAnsi="Times New Roman" w:cs="Times New Roman"/>
         </w:rPr>
-        <w:t>Existe una capa de evidencia documentada de accesibilidad (etiquetas OSM de accesibilidad y paradas GTFS con wheelchair_boarding positivo) y una variante experimen</w:t>
-      </w:r>
-      <w:r>
-        <w:rPr>
-          <w:rFonts w:ascii="Times New Roman" w:hAnsi="Times New Roman" w:cs="Times New Roman"/>
-        </w:rPr>
-        <w:t>tal del índice, el «TSMAI extendido», que combina el TSMAI V9 oficial con esta evidencia. Se presenta siempre como opcional y experimental: la proximidad a una etiqueta de accesibilidad en el mapa no equivale a una auditoría de accesibilidad física real, y</w:t>
-      </w:r>
-      <w:r>
-        <w:rPr>
-          <w:rFonts w:ascii="Times New Roman" w:hAnsi="Times New Roman" w:cs="Times New Roman"/>
-        </w:rPr>
-        <w:t xml:space="preserve"> así se comunica en el propio panel.</w:t>
+        <w:t xml:space="preserve">El sistema incorpora un modelo de análisis de sentimiento multilingüe (BERT) capaz de </w:t>
+      </w:r>
+      <w:r>
+        <w:rPr>
+          <w:rFonts w:ascii="Times New Roman" w:hAnsi="Times New Roman" w:cs="Times New Roman"/>
+        </w:rPr>
+        <w:t>clasificar reseñas como positivas, neutras o negativas y detectar si mencionan movilidad (autobús, caminar, bicicleta, accesibilidad, tráfico). Durante la fase final del proyecto se incorporó un corpus real de reseñas de Inside Airbnb correspondiente a Mal</w:t>
+      </w:r>
+      <w:r>
+        <w:rPr>
+          <w:rFonts w:ascii="Times New Roman" w:hAnsi="Times New Roman" w:cs="Times New Roman"/>
+        </w:rPr>
+        <w:t>lorca (licencia Creative Commons Atribución 4.0, verificada directamente en la fuente), sobre el que se ha ejecutado el análisis de sentimiento por primera vez con datos reales, en una muestra de 1.530 reseñas (30 por municipio, sobre un total de 397.789 r</w:t>
+      </w:r>
+      <w:r>
+        <w:rPr>
+          <w:rFonts w:ascii="Times New Roman" w:hAnsi="Times New Roman" w:cs="Times New Roman"/>
+        </w:rPr>
+        <w:t>eseñas disponibles vinculadas a un municipio del proyecto).</w:t>
       </w:r>
     </w:p>
     <w:p>
       <w:pPr>
-        <w:spacing w:after="280"/>
-        <w:rPr>
-          <w:rFonts w:ascii="Times New Roman" w:hAnsi="Times New Roman" w:cs="Times New Roman"/>
-        </w:rPr>
-      </w:pPr>
-      <w:r>
-        <w:rPr>
-          <w:rFonts w:ascii="Times New Roman" w:hAnsi="Times New Roman" w:cs="Times New Roman"/>
-          <w:i/>
-        </w:rPr>
-        <w:t>→ Anexo I — Alcance extendido: sentimiento y accesibilidad universal · Anexo J — Gobernanza de datos y consentimiento</w:t>
+        <w:spacing w:after="160"/>
+        <w:rPr>
+          <w:rFonts w:ascii="Times New Roman" w:hAnsi="Times New Roman" w:cs="Times New Roman"/>
+        </w:rPr>
+      </w:pPr>
+      <w:r>
+        <w:rPr>
+          <w:rFonts w:ascii="Times New Roman" w:hAnsi="Times New Roman" w:cs="Times New Roman"/>
+        </w:rPr>
+        <w:t>El resultado se agrega siempre por municipio, nunca se publica el texto de una reseña individual, y solo se muestra una media cuando hay al menos 10 reseñas relevantes de movilidad en ese municipi</w:t>
+      </w:r>
+      <w:r>
+        <w:rPr>
+          <w:rFonts w:ascii="Times New Roman" w:hAnsi="Times New Roman" w:cs="Times New Roman"/>
+        </w:rPr>
+        <w:t>o — para evitar conclusiones inestables sobre muestras pequeñas. Con esta primera muestra de validación, de las 1.530 reseñas analizadas solo 194 (12,7 %) mencionan explícitamente movilidad, y ningún municipio alcanza todavía las 10 menciones necesarias pa</w:t>
+      </w:r>
+      <w:r>
+        <w:rPr>
+          <w:rFonts w:ascii="Times New Roman" w:hAnsi="Times New Roman" w:cs="Times New Roman"/>
+        </w:rPr>
+        <w:t>ra publicar una media (el máximo es 9, en Alaró y Andratx). Es un resultado honesto, no un fallo del sistema: confirma que el pipeline funciona de punta a punta con datos reales, y deja acotado cuánto haría falta ampliar la muestra —del orden de varios mil</w:t>
+      </w:r>
+      <w:r>
+        <w:rPr>
+          <w:rFonts w:ascii="Times New Roman" w:hAnsi="Times New Roman" w:cs="Times New Roman"/>
+        </w:rPr>
+        <w:t>es de reseñas por municipio— para empezar a publicar resultados.</w:t>
       </w:r>
     </w:p>
     <w:p>
       <w:pPr>
-        <w:rPr>
-          <w:rFonts w:ascii="Times New Roman" w:hAnsi="Times New Roman" w:cs="Times New Roman"/>
-        </w:rPr>
-      </w:pPr>
-      <w:r>
-        <w:rPr>
-          <w:rFonts w:ascii="Times New Roman" w:hAnsi="Times New Roman" w:cs="Times New Roman"/>
-        </w:rPr>
-        <w:br w:type="page"/>
+        <w:spacing w:after="160" w:line="276" w:lineRule="auto"/>
+      </w:pPr>
+      <w:r>
+        <w:rPr>
+          <w:rFonts w:ascii="Times New Roman" w:hAnsi="Times New Roman"/>
+          <w:b w:val="0"/>
+          <w:i w:val="0"/>
+          <w:sz w:val="22"/>
+        </w:rPr>
+        <w:t>Sobre las 1.530 reseñas analizadas, el modelo clasificó 1.480 como positivas (96,7 %), 26 como neutras y 24 como negativas. Esa fuerte asimetría es habitual en plataformas de alquiler vacacional, donde predominan las valoraciones favorables, y es una razón adicional para no leer el resultado como un diagnóstico de movilidad: el modelo utilizado (nlptown/bert-base-multilingual-uncased-sentiment, licencia MIT) está entrenado para sentimiento general y no específicamente para movilidad turística, y la detección de menciones de movilidad usa un diccionario conservador que debería validarse manualmente antes de cualquier inferencia territorial.</w:t>
       </w:r>
     </w:p>
     <w:p>
       <w:pPr>
+        <w:pStyle w:val="Ttulo2"/>
+        <w:rPr>
+          <w:rFonts w:ascii="Times New Roman" w:hAnsi="Times New Roman" w:cs="Times New Roman"/>
+          <w:color w:val="auto"/>
+          <w:sz w:val="22"/>
+          <w:szCs w:val="22"/>
+        </w:rPr>
+      </w:pPr>
+      <w:r>
+        <w:rPr>
+          <w:rFonts w:ascii="Times New Roman" w:hAnsi="Times New Roman" w:cs="Times New Roman"/>
+          <w:color w:val="auto"/>
+          <w:sz w:val="22"/>
+          <w:szCs w:val="22"/>
+        </w:rPr>
+        <w:t>9.2 Accesibilidad universal</w:t>
+      </w:r>
+    </w:p>
+    <w:p>
+      <w:pPr>
+        <w:spacing w:after="160"/>
+        <w:rPr>
+          <w:rFonts w:ascii="Times New Roman" w:hAnsi="Times New Roman" w:cs="Times New Roman"/>
+        </w:rPr>
+      </w:pPr>
+      <w:r>
+        <w:rPr>
+          <w:rFonts w:ascii="Times New Roman" w:hAnsi="Times New Roman" w:cs="Times New Roman"/>
+        </w:rPr>
+        <w:t>Existe una capa de evidencia documentada de accesibilidad (etiquetas OSM de accesibilidad y paradas GTFS con wheelchair_boarding positivo) y una variante experimen</w:t>
+      </w:r>
+      <w:r>
+        <w:rPr>
+          <w:rFonts w:ascii="Times New Roman" w:hAnsi="Times New Roman" w:cs="Times New Roman"/>
+        </w:rPr>
+        <w:t>tal del índice, el «TSMAI extendido», que combina el TSMAI V9 oficial con esta evidencia. Se presenta siempre como opcional y experimental: la proximidad a una etiqueta de accesibilidad en el mapa no equivale a una auditoría de accesibilidad física real, y</w:t>
+      </w:r>
+      <w:r>
+        <w:rPr>
+          <w:rFonts w:ascii="Times New Roman" w:hAnsi="Times New Roman" w:cs="Times New Roman"/>
+        </w:rPr>
+        <w:t xml:space="preserve"> así se comunica en el propio panel.</w:t>
+      </w:r>
+    </w:p>
+    <w:p>
+      <w:pPr>
+        <w:pStyle w:val="Ttulo2"/>
+        <w:rPr>
+          <w:rFonts w:ascii="Times New Roman" w:hAnsi="Times New Roman" w:cs="Times New Roman"/>
+          <w:color w:val="auto"/>
+          <w:sz w:val="22"/>
+          <w:szCs w:val="22"/>
+        </w:rPr>
+      </w:pPr>
+      <w:r>
+        <w:rPr>
+          <w:rFonts w:ascii="Times New Roman" w:hAnsi="Times New Roman" w:cs="Times New Roman"/>
+          <w:color w:val="auto"/>
+          <w:sz w:val="22"/>
+          <w:szCs w:val="22"/>
+        </w:rPr>
+        <w:t>9.3 Narrativas explicativas de rutas</w:t>
+      </w:r>
+    </w:p>
+    <w:p>
+      <w:pPr>
+        <w:spacing w:after="160" w:line="276" w:lineRule="auto"/>
+      </w:pPr>
+      <w:r>
+        <w:rPr>
+          <w:rFonts w:ascii="Times New Roman" w:hAnsi="Times New Roman"/>
+          <w:b w:val="0"/>
+          <w:i w:val="0"/>
+          <w:sz w:val="22"/>
+        </w:rPr>
+        <w:t>El desafío también contempla explicar en lenguaje natural por qué se recomienda un modo de transporte. Para los 20 casos de referencia origen–destino, el sistema genera una narrativa breve a partir de la evidencia real de cada ruta (duración a pie, en bicicleta y en transporte público, caminata, transbordos y contexto de infraestructura ciclista).</w:t>
+      </w:r>
+    </w:p>
+    <w:p>
+      <w:pPr>
+        <w:spacing w:after="160" w:line="276" w:lineRule="auto"/>
+      </w:pPr>
+      <w:r>
+        <w:rPr>
+          <w:rFonts w:ascii="Times New Roman" w:hAnsi="Times New Roman"/>
+          <w:b w:val="0"/>
+          <w:i w:val="0"/>
+          <w:sz w:val="22"/>
+        </w:rPr>
+        <w:t>Esas narrativas las produce un generador heurístico basado en reglas —en el código figura como «mock heurístico»— y así se declara tanto en el informe de ejecución como en la interfaz («Narrativa de la ruta (reglas heurísticas)»). El código incluye una vía opcional para generarlas con un modelo de lenguaje (Gemini) si se configura una clave de API, pero los resultados entregados no proceden de un modelo generativo y no deben presentarse como tales. Es una decisión deliberada: evita atribuir a una IA un texto que en realidad es una plantilla explicable y verificable, en coherencia con el principio de transparencia del proyecto.</w:t>
+      </w:r>
+    </w:p>
+    <w:p>
+      <w:pPr>
+        <w:spacing w:after="280"/>
+        <w:rPr>
+          <w:rFonts w:ascii="Times New Roman" w:hAnsi="Times New Roman" w:cs="Times New Roman"/>
+        </w:rPr>
+      </w:pPr>
+      <w:r>
+        <w:rPr>
+          <w:rFonts w:ascii="Times New Roman" w:hAnsi="Times New Roman" w:cs="Times New Roman"/>
+          <w:i/>
+        </w:rPr>
+        <w:t>→ Anexo I — Alcance extendido: sentimiento y accesibilidad universal · Anexo J — Gobernanza de datos y consentimiento</w:t>
+      </w:r>
+    </w:p>
+    <w:p>
+      <w:pPr>
+        <w:rPr>
+          <w:rFonts w:ascii="Times New Roman" w:hAnsi="Times New Roman" w:cs="Times New Roman"/>
+        </w:rPr>
+      </w:pPr>
+      <w:r>
+        <w:rPr>
+          <w:rFonts w:ascii="Times New Roman" w:hAnsi="Times New Roman" w:cs="Times New Roman"/>
+        </w:rPr>
+        <w:br w:type="page"/>
+      </w:r>
+    </w:p>
+    <w:p>
+      <w:pPr>
         <w:pStyle w:val="Ttulo1"/>
       </w:pPr>
       <w:r>
@@ -6468,28 +6998,21 @@
       <w:pPr>
         <w:pStyle w:val="Listaconvietas"/>
         <w:spacing w:after="120"/>
-        <w:rPr>
-          <w:rFonts w:ascii="Times New Roman" w:hAnsi="Times New Roman" w:cs="Times New Roman"/>
-        </w:rPr>
-      </w:pPr>
-      <w:r>
-        <w:rPr>
-          <w:rFonts w:ascii="Times New Roman" w:hAnsi="Times New Roman" w:cs="Times New Roman"/>
+      </w:pPr>
+      <w:r>
+        <w:rPr>
+          <w:rFonts w:ascii="Times New Roman" w:hAnsi="Times New Roman"/>
           <w:b/>
-        </w:rPr>
-        <w:t xml:space="preserve">La seguridad vial (DGT) solo identifica con confianza 15 de los 43 municipios de la fuente local </w:t>
-      </w:r>
-      <w:r>
-        <w:rPr>
-          <w:rFonts w:ascii="Times New Roman" w:hAnsi="Times New Roman" w:cs="Times New Roman"/>
-        </w:rPr>
-        <w:t>y no es atribuible a una ruta o alojam</w:t>
-      </w:r>
-      <w:r>
-        <w:rPr>
-          <w:rFonts w:ascii="Times New Roman" w:hAnsi="Times New Roman" w:cs="Times New Roman"/>
-        </w:rPr>
-        <w:t>iento concreto.</w:t>
+          <w:sz w:val="22"/>
+        </w:rPr>
+        <w:t xml:space="preserve">Las narrativas de ruta no son texto generado por un modelo de lenguaje. </w:t>
+      </w:r>
+      <w:r>
+        <w:rPr>
+          <w:rFonts w:ascii="Times New Roman" w:hAnsi="Times New Roman"/>
+          <w:sz w:val="22"/>
+        </w:rPr>
+        <w:t>Son plantillas basadas en reglas sobre la evidencia de OTP; la vía con LLM existe en el código pero no se ha ejecutado en los resultados entregados (sección 9.3).</w:t>
       </w:r>
     </w:p>
     <w:p>
@@ -6505,30 +7028,58 @@
           <w:rFonts w:ascii="Times New Roman" w:hAnsi="Times New Roman" w:cs="Times New Roman"/>
           <w:b/>
         </w:rPr>
-        <w:t xml:space="preserve">Los pesos del índice y de los escenarios de sensibilidad son decisiones analíticas explícitas y documentadas, </w:t>
-      </w:r>
-      <w:r>
-        <w:rPr>
-          <w:rFonts w:ascii="Times New Roman" w:hAnsi="Times New Roman" w:cs="Times New Roman"/>
-        </w:rPr>
-        <w:t>no una calibración estadística contra un resultado observado de movilidad real.</w:t>
+        <w:t xml:space="preserve">La seguridad vial (DGT) solo identifica con confianza 15 de los 43 municipios de la fuente local </w:t>
+      </w:r>
+      <w:r>
+        <w:rPr>
+          <w:rFonts w:ascii="Times New Roman" w:hAnsi="Times New Roman" w:cs="Times New Roman"/>
+        </w:rPr>
+        <w:t>y no es atribuible a una ruta o alojam</w:t>
+      </w:r>
+      <w:r>
+        <w:rPr>
+          <w:rFonts w:ascii="Times New Roman" w:hAnsi="Times New Roman" w:cs="Times New Roman"/>
+        </w:rPr>
+        <w:t>iento concreto.</w:t>
       </w:r>
     </w:p>
     <w:p>
       <w:pPr>
-        <w:rPr>
-          <w:rFonts w:ascii="Times New Roman" w:hAnsi="Times New Roman" w:cs="Times New Roman"/>
-        </w:rPr>
-      </w:pPr>
-      <w:r>
-        <w:rPr>
-          <w:rFonts w:ascii="Times New Roman" w:hAnsi="Times New Roman" w:cs="Times New Roman"/>
-        </w:rPr>
-        <w:br w:type="page"/>
+        <w:pStyle w:val="Listaconvietas"/>
+        <w:spacing w:after="120"/>
+        <w:rPr>
+          <w:rFonts w:ascii="Times New Roman" w:hAnsi="Times New Roman" w:cs="Times New Roman"/>
+        </w:rPr>
+      </w:pPr>
+      <w:r>
+        <w:rPr>
+          <w:rFonts w:ascii="Times New Roman" w:hAnsi="Times New Roman" w:cs="Times New Roman"/>
+          <w:b/>
+        </w:rPr>
+        <w:t xml:space="preserve">Los pesos del índice y de los escenarios de sensibilidad son decisiones analíticas explícitas y documentadas, </w:t>
+      </w:r>
+      <w:r>
+        <w:rPr>
+          <w:rFonts w:ascii="Times New Roman" w:hAnsi="Times New Roman" w:cs="Times New Roman"/>
+        </w:rPr>
+        <w:t>no una calibración estadística contra un resultado observado de movilidad real.</w:t>
       </w:r>
     </w:p>
     <w:p>
       <w:pPr>
+        <w:rPr>
+          <w:rFonts w:ascii="Times New Roman" w:hAnsi="Times New Roman" w:cs="Times New Roman"/>
+        </w:rPr>
+      </w:pPr>
+      <w:r>
+        <w:rPr>
+          <w:rFonts w:ascii="Times New Roman" w:hAnsi="Times New Roman" w:cs="Times New Roman"/>
+        </w:rPr>
+        <w:br w:type="page"/>
+      </w:r>
+    </w:p>
+    <w:p>
+      <w:pPr>
         <w:pStyle w:val="Ttulo1"/>
       </w:pPr>
       <w:r>
@@ -6764,6 +7315,701 @@
           <w:rFonts w:ascii="Times New Roman" w:hAnsi="Times New Roman" w:cs="Times New Roman"/>
         </w:rPr>
         <w:t>bre la que seguir construyendo.</w:t>
+      </w:r>
+    </w:p>
+    <w:p>
+      <w:pPr>
+        <w:pStyle w:val="Ttulo2"/>
+        <w:rPr>
+          <w:rFonts w:ascii="Times New Roman" w:hAnsi="Times New Roman" w:cs="Times New Roman"/>
+          <w:color w:val="auto"/>
+          <w:sz w:val="22"/>
+          <w:szCs w:val="22"/>
+        </w:rPr>
+      </w:pPr>
+      <w:r>
+        <w:rPr>
+          <w:rFonts w:ascii="Times New Roman" w:hAnsi="Times New Roman" w:cs="Times New Roman"/>
+          <w:color w:val="auto"/>
+          <w:sz w:val="22"/>
+          <w:szCs w:val="22"/>
+        </w:rPr>
+        <w:t>12.1 Cumplimiento de los requisitos del desafío</w:t>
+      </w:r>
+    </w:p>
+    <w:p>
+      <w:pPr>
+        <w:spacing w:after="160" w:line="276" w:lineRule="auto"/>
+      </w:pPr>
+      <w:r>
+        <w:rPr>
+          <w:rFonts w:ascii="Times New Roman" w:hAnsi="Times New Roman"/>
+          <w:b w:val="0"/>
+          <w:i w:val="0"/>
+          <w:sz w:val="22"/>
+        </w:rPr>
+        <w:t>La siguiente tabla resume, de forma honesta, en qué medida cubre el proyecto cada requisito del Desafío 4 y dónde se desarrolla en este documento.</w:t>
+      </w:r>
+    </w:p>
+    <w:tbl>
+      <w:tblPr>
+        <w:tblStyle w:val="Tablaconcuadrcula"/>
+        <w:tblW w:type="auto" w:w="0"/>
+        <w:tblLayout w:type="fixed"/>
+        <w:tblLook w:firstColumn="1" w:firstRow="1" w:lastColumn="0" w:lastRow="0" w:noHBand="0" w:noVBand="1" w:val="04A0"/>
+      </w:tblPr>
+      <w:tblGrid>
+        <w:gridCol w:w="3137"/>
+        <w:gridCol w:w="3137"/>
+        <w:gridCol w:w="3137"/>
+      </w:tblGrid>
+      <w:tr>
+        <w:tc>
+          <w:tcPr>
+            <w:tcW w:type="dxa" w:w="4082"/>
+            <w:vAlign w:val="center"/>
+            <w:shd w:val="clear" w:fill="1F3864"/>
+          </w:tcPr>
+          <w:p>
+            <w:pPr>
+              <w:jc w:val="center"/>
+            </w:pPr>
+            <w:r>
+              <w:rPr>
+                <w:rFonts w:ascii="Times New Roman" w:hAnsi="Times New Roman"/>
+                <w:b/>
+                <w:color w:val="FFFFFF"/>
+                <w:sz w:val="20"/>
+              </w:rPr>
+              <w:t>Requisito del desafío</w:t>
+            </w:r>
+          </w:p>
+        </w:tc>
+        <w:tc>
+          <w:tcPr>
+            <w:tcW w:type="dxa" w:w="3402"/>
+            <w:vAlign w:val="center"/>
+            <w:shd w:val="clear" w:fill="1F3864"/>
+          </w:tcPr>
+          <w:p>
+            <w:pPr>
+              <w:jc w:val="center"/>
+            </w:pPr>
+            <w:r>
+              <w:rPr>
+                <w:rFonts w:ascii="Times New Roman" w:hAnsi="Times New Roman"/>
+                <w:b/>
+                <w:color w:val="FFFFFF"/>
+                <w:sz w:val="20"/>
+              </w:rPr>
+              <w:t>Estado</w:t>
+            </w:r>
+          </w:p>
+        </w:tc>
+        <w:tc>
+          <w:tcPr>
+            <w:tcW w:type="dxa" w:w="1928"/>
+            <w:vAlign w:val="center"/>
+            <w:shd w:val="clear" w:fill="1F3864"/>
+          </w:tcPr>
+          <w:p>
+            <w:pPr>
+              <w:jc w:val="center"/>
+            </w:pPr>
+            <w:r>
+              <w:rPr>
+                <w:rFonts w:ascii="Times New Roman" w:hAnsi="Times New Roman"/>
+                <w:b/>
+                <w:color w:val="FFFFFF"/>
+                <w:sz w:val="20"/>
+              </w:rPr>
+              <w:t>Dónde se explica</w:t>
+            </w:r>
+          </w:p>
+        </w:tc>
+      </w:tr>
+      <w:tr>
+        <w:tc>
+          <w:tcPr>
+            <w:tcW w:type="dxa" w:w="4082"/>
+            <w:vAlign w:val="center"/>
+            <w:shd w:val="clear" w:fill="F2F2F2"/>
+          </w:tcPr>
+          <w:p>
+            <w:r>
+              <w:rPr>
+                <w:rFonts w:ascii="Times New Roman" w:hAnsi="Times New Roman"/>
+                <w:sz w:val="20"/>
+              </w:rPr>
+              <w:t>Integración de datos geoespaciales e infraestructura (alojamientos, red peatonal y ciclista, transporte público, puntos de interés)</w:t>
+            </w:r>
+          </w:p>
+        </w:tc>
+        <w:tc>
+          <w:tcPr>
+            <w:tcW w:type="dxa" w:w="3402"/>
+            <w:vAlign w:val="center"/>
+            <w:shd w:val="clear" w:fill="F2F2F2"/>
+          </w:tcPr>
+          <w:p>
+            <w:r>
+              <w:rPr>
+                <w:rFonts w:ascii="Times New Roman" w:hAnsi="Times New Roman"/>
+                <w:sz w:val="20"/>
+              </w:rPr>
+              <w:t>Cumplido</w:t>
+            </w:r>
+          </w:p>
+        </w:tc>
+        <w:tc>
+          <w:tcPr>
+            <w:tcW w:type="dxa" w:w="1928"/>
+            <w:vAlign w:val="center"/>
+            <w:shd w:val="clear" w:fill="F2F2F2"/>
+          </w:tcPr>
+          <w:p>
+            <w:r>
+              <w:rPr>
+                <w:rFonts w:ascii="Times New Roman" w:hAnsi="Times New Roman"/>
+                <w:sz w:val="20"/>
+              </w:rPr>
+              <w:t>Secciones 3 y 4</w:t>
+            </w:r>
+          </w:p>
+        </w:tc>
+      </w:tr>
+      <w:tr>
+        <w:tc>
+          <w:tcPr>
+            <w:tcW w:type="dxa" w:w="4082"/>
+            <w:vAlign w:val="center"/>
+          </w:tcPr>
+          <w:p>
+            <w:r>
+              <w:rPr>
+                <w:rFonts w:ascii="Times New Roman" w:hAnsi="Times New Roman"/>
+                <w:sz w:val="20"/>
+              </w:rPr>
+              <w:t>Rutas multimodales reales (a pie, bicicleta, transporte público y coche)</w:t>
+            </w:r>
+          </w:p>
+        </w:tc>
+        <w:tc>
+          <w:tcPr>
+            <w:tcW w:type="dxa" w:w="3402"/>
+            <w:vAlign w:val="center"/>
+          </w:tcPr>
+          <w:p>
+            <w:r>
+              <w:rPr>
+                <w:rFonts w:ascii="Times New Roman" w:hAnsi="Times New Roman"/>
+                <w:sz w:val="20"/>
+              </w:rPr>
+              <w:t>Cumplido: motor OTP con 98,5 % de rutas calculadas</w:t>
+            </w:r>
+          </w:p>
+        </w:tc>
+        <w:tc>
+          <w:tcPr>
+            <w:tcW w:type="dxa" w:w="1928"/>
+            <w:vAlign w:val="center"/>
+          </w:tcPr>
+          <w:p>
+            <w:r>
+              <w:rPr>
+                <w:rFonts w:ascii="Times New Roman" w:hAnsi="Times New Roman"/>
+                <w:sz w:val="20"/>
+              </w:rPr>
+              <w:t>Secciones 6.6, 6.7 y 8</w:t>
+            </w:r>
+          </w:p>
+        </w:tc>
+      </w:tr>
+      <w:tr>
+        <w:tc>
+          <w:tcPr>
+            <w:tcW w:type="dxa" w:w="4082"/>
+            <w:vAlign w:val="center"/>
+            <w:shd w:val="clear" w:fill="F2F2F2"/>
+          </w:tcPr>
+          <w:p>
+            <w:r>
+              <w:rPr>
+                <w:rFonts w:ascii="Times New Roman" w:hAnsi="Times New Roman"/>
+                <w:sz w:val="20"/>
+              </w:rPr>
+              <w:t>Índice explicable de accesibilidad y movilidad sostenible (TSMAI)</w:t>
+            </w:r>
+          </w:p>
+        </w:tc>
+        <w:tc>
+          <w:tcPr>
+            <w:tcW w:type="dxa" w:w="3402"/>
+            <w:vAlign w:val="center"/>
+            <w:shd w:val="clear" w:fill="F2F2F2"/>
+          </w:tcPr>
+          <w:p>
+            <w:r>
+              <w:rPr>
+                <w:rFonts w:ascii="Times New Roman" w:hAnsi="Times New Roman"/>
+                <w:sz w:val="20"/>
+              </w:rPr>
+              <w:t>Cumplido: V9 con análisis de sensibilidad</w:t>
+            </w:r>
+          </w:p>
+        </w:tc>
+        <w:tc>
+          <w:tcPr>
+            <w:tcW w:type="dxa" w:w="1928"/>
+            <w:vAlign w:val="center"/>
+            <w:shd w:val="clear" w:fill="F2F2F2"/>
+          </w:tcPr>
+          <w:p>
+            <w:r>
+              <w:rPr>
+                <w:rFonts w:ascii="Times New Roman" w:hAnsi="Times New Roman"/>
+                <w:sz w:val="20"/>
+              </w:rPr>
+              <w:t>Sección 5</w:t>
+            </w:r>
+          </w:p>
+        </w:tc>
+      </w:tr>
+      <w:tr>
+        <w:tc>
+          <w:tcPr>
+            <w:tcW w:type="dxa" w:w="4082"/>
+            <w:vAlign w:val="center"/>
+          </w:tcPr>
+          <w:p>
+            <w:r>
+              <w:rPr>
+                <w:rFonts w:ascii="Times New Roman" w:hAnsi="Times New Roman"/>
+                <w:sz w:val="20"/>
+              </w:rPr>
+              <w:t>Mapas interactivos y panel de control para el cliente</w:t>
+            </w:r>
+          </w:p>
+        </w:tc>
+        <w:tc>
+          <w:tcPr>
+            <w:tcW w:type="dxa" w:w="3402"/>
+            <w:vAlign w:val="center"/>
+          </w:tcPr>
+          <w:p>
+            <w:r>
+              <w:rPr>
+                <w:rFonts w:ascii="Times New Roman" w:hAnsi="Times New Roman"/>
+                <w:sz w:val="20"/>
+              </w:rPr>
+              <w:t>Cumplido: siete pantallas</w:t>
+            </w:r>
+          </w:p>
+        </w:tc>
+        <w:tc>
+          <w:tcPr>
+            <w:tcW w:type="dxa" w:w="1928"/>
+            <w:vAlign w:val="center"/>
+          </w:tcPr>
+          <w:p>
+            <w:r>
+              <w:rPr>
+                <w:rFonts w:ascii="Times New Roman" w:hAnsi="Times New Roman"/>
+                <w:sz w:val="20"/>
+              </w:rPr>
+              <w:t>Sección 6</w:t>
+            </w:r>
+          </w:p>
+        </w:tc>
+      </w:tr>
+      <w:tr>
+        <w:tc>
+          <w:tcPr>
+            <w:tcW w:type="dxa" w:w="4082"/>
+            <w:vAlign w:val="center"/>
+            <w:shd w:val="clear" w:fill="F2F2F2"/>
+          </w:tcPr>
+          <w:p>
+            <w:r>
+              <w:rPr>
+                <w:rFonts w:ascii="Times New Roman" w:hAnsi="Times New Roman"/>
+                <w:sz w:val="20"/>
+              </w:rPr>
+              <w:t>Análisis de sentimiento de usuarios</w:t>
+            </w:r>
+          </w:p>
+        </w:tc>
+        <w:tc>
+          <w:tcPr>
+            <w:tcW w:type="dxa" w:w="3402"/>
+            <w:vAlign w:val="center"/>
+            <w:shd w:val="clear" w:fill="F2F2F2"/>
+          </w:tcPr>
+          <w:p>
+            <w:r>
+              <w:rPr>
+                <w:rFonts w:ascii="Times New Roman" w:hAnsi="Times New Roman"/>
+                <w:sz w:val="20"/>
+              </w:rPr>
+              <w:t>Pipeline ejecutado con datos reales; publicación limitada por el tamaño de la muestra (ningún municipio alcanza 10 menciones)</w:t>
+            </w:r>
+          </w:p>
+        </w:tc>
+        <w:tc>
+          <w:tcPr>
+            <w:tcW w:type="dxa" w:w="1928"/>
+            <w:vAlign w:val="center"/>
+            <w:shd w:val="clear" w:fill="F2F2F2"/>
+          </w:tcPr>
+          <w:p>
+            <w:r>
+              <w:rPr>
+                <w:rFonts w:ascii="Times New Roman" w:hAnsi="Times New Roman"/>
+                <w:sz w:val="20"/>
+              </w:rPr>
+              <w:t>Sección 9.1</w:t>
+            </w:r>
+          </w:p>
+        </w:tc>
+      </w:tr>
+      <w:tr>
+        <w:tc>
+          <w:tcPr>
+            <w:tcW w:type="dxa" w:w="4082"/>
+            <w:vAlign w:val="center"/>
+          </w:tcPr>
+          <w:p>
+            <w:r>
+              <w:rPr>
+                <w:rFonts w:ascii="Times New Roman" w:hAnsi="Times New Roman"/>
+                <w:sz w:val="20"/>
+              </w:rPr>
+              <w:t>Narrativas explicativas de las rutas</w:t>
+            </w:r>
+          </w:p>
+        </w:tc>
+        <w:tc>
+          <w:tcPr>
+            <w:tcW w:type="dxa" w:w="3402"/>
+            <w:vAlign w:val="center"/>
+          </w:tcPr>
+          <w:p>
+            <w:r>
+              <w:rPr>
+                <w:rFonts w:ascii="Times New Roman" w:hAnsi="Times New Roman"/>
+                <w:sz w:val="20"/>
+              </w:rPr>
+              <w:t>Generador heurístico entregado; vía con LLM opcional y no ejecutada</w:t>
+            </w:r>
+          </w:p>
+        </w:tc>
+        <w:tc>
+          <w:tcPr>
+            <w:tcW w:type="dxa" w:w="1928"/>
+            <w:vAlign w:val="center"/>
+          </w:tcPr>
+          <w:p>
+            <w:r>
+              <w:rPr>
+                <w:rFonts w:ascii="Times New Roman" w:hAnsi="Times New Roman"/>
+                <w:sz w:val="20"/>
+              </w:rPr>
+              <w:t>Sección 9.3</w:t>
+            </w:r>
+          </w:p>
+        </w:tc>
+      </w:tr>
+      <w:tr>
+        <w:tc>
+          <w:tcPr>
+            <w:tcW w:type="dxa" w:w="4082"/>
+            <w:vAlign w:val="center"/>
+            <w:shd w:val="clear" w:fill="F2F2F2"/>
+          </w:tcPr>
+          <w:p>
+            <w:r>
+              <w:rPr>
+                <w:rFonts w:ascii="Times New Roman" w:hAnsi="Times New Roman"/>
+                <w:sz w:val="20"/>
+              </w:rPr>
+              <w:t>Accesibilidad universal</w:t>
+            </w:r>
+          </w:p>
+        </w:tc>
+        <w:tc>
+          <w:tcPr>
+            <w:tcW w:type="dxa" w:w="3402"/>
+            <w:vAlign w:val="center"/>
+            <w:shd w:val="clear" w:fill="F2F2F2"/>
+          </w:tcPr>
+          <w:p>
+            <w:r>
+              <w:rPr>
+                <w:rFonts w:ascii="Times New Roman" w:hAnsi="Times New Roman"/>
+                <w:sz w:val="20"/>
+              </w:rPr>
+              <w:t>Evidencia documental y TSMAI extendido experimental; no es una certificación</w:t>
+            </w:r>
+          </w:p>
+        </w:tc>
+        <w:tc>
+          <w:tcPr>
+            <w:tcW w:type="dxa" w:w="1928"/>
+            <w:vAlign w:val="center"/>
+            <w:shd w:val="clear" w:fill="F2F2F2"/>
+          </w:tcPr>
+          <w:p>
+            <w:r>
+              <w:rPr>
+                <w:rFonts w:ascii="Times New Roman" w:hAnsi="Times New Roman"/>
+                <w:sz w:val="20"/>
+              </w:rPr>
+              <w:t>Sección 9.2</w:t>
+            </w:r>
+          </w:p>
+        </w:tc>
+      </w:tr>
+      <w:tr>
+        <w:tc>
+          <w:tcPr>
+            <w:tcW w:type="dxa" w:w="4082"/>
+            <w:vAlign w:val="center"/>
+          </w:tcPr>
+          <w:p>
+            <w:r>
+              <w:rPr>
+                <w:rFonts w:ascii="Times New Roman" w:hAnsi="Times New Roman"/>
+                <w:sz w:val="20"/>
+              </w:rPr>
+              <w:t>Reproducibilidad y licencias de los datos</w:t>
+            </w:r>
+          </w:p>
+        </w:tc>
+        <w:tc>
+          <w:tcPr>
+            <w:tcW w:type="dxa" w:w="3402"/>
+            <w:vAlign w:val="center"/>
+          </w:tcPr>
+          <w:p>
+            <w:r>
+              <w:rPr>
+                <w:rFonts w:ascii="Times New Roman" w:hAnsi="Times New Roman"/>
+                <w:sz w:val="20"/>
+              </w:rPr>
+              <w:t>Cumplido: 21 pruebas, 50 tareas verificables y licencias documentadas</w:t>
+            </w:r>
+          </w:p>
+        </w:tc>
+        <w:tc>
+          <w:tcPr>
+            <w:tcW w:type="dxa" w:w="1928"/>
+            <w:vAlign w:val="center"/>
+          </w:tcPr>
+          <w:p>
+            <w:r>
+              <w:rPr>
+                <w:rFonts w:ascii="Times New Roman" w:hAnsi="Times New Roman"/>
+                <w:sz w:val="20"/>
+              </w:rPr>
+              <w:t>Secciones 3 y 8</w:t>
+            </w:r>
+          </w:p>
+        </w:tc>
+      </w:tr>
+    </w:tbl>
+    <w:p>
+      <w:pPr>
+        <w:spacing w:after="80"/>
+      </w:pPr>
+    </w:p>
+    <w:p>
+      <w:pPr>
+        <w:pStyle w:val="Ttulo1"/>
+      </w:pPr>
+      <w:r>
+        <w:t>Referencias</w:t>
+      </w:r>
+    </w:p>
+    <w:p>
+      <w:pPr>
+        <w:spacing w:after="80" w:line="276" w:lineRule="auto"/>
+      </w:pPr>
+      <w:r>
+        <w:rPr>
+          <w:rFonts w:ascii="Times New Roman" w:hAnsi="Times New Roman"/>
+          <w:b w:val="0"/>
+          <w:i w:val="0"/>
+          <w:sz w:val="20"/>
+        </w:rPr>
+        <w:t>OpenStreetMap contributors. OpenStreetMap (licencia ODbL). https://www.openstreetmap.org</w:t>
+      </w:r>
+    </w:p>
+    <w:p>
+      <w:pPr>
+        <w:spacing w:after="80" w:line="276" w:lineRule="auto"/>
+      </w:pPr>
+      <w:r>
+        <w:rPr>
+          <w:rFonts w:ascii="Times New Roman" w:hAnsi="Times New Roman"/>
+          <w:b w:val="0"/>
+          <w:i w:val="0"/>
+          <w:sz w:val="20"/>
+        </w:rPr>
+        <w:t>OpenTripPlanner. Motor de planificación de rutas multimodal de código abierto. https://www.opentripplanner.org</w:t>
+      </w:r>
+    </w:p>
+    <w:p>
+      <w:pPr>
+        <w:spacing w:after="80" w:line="276" w:lineRule="auto"/>
+      </w:pPr>
+      <w:r>
+        <w:rPr>
+          <w:rFonts w:ascii="Times New Roman" w:hAnsi="Times New Roman"/>
+          <w:b w:val="0"/>
+          <w:i w:val="0"/>
+          <w:sz w:val="20"/>
+        </w:rPr>
+        <w:t>GTFS. Especificación General Transit Feed Specification. https://gtfs.org (datos: feed GTFS de transporte público de Mallorca, TIB).</w:t>
+      </w:r>
+    </w:p>
+    <w:p>
+      <w:pPr>
+        <w:spacing w:after="80" w:line="276" w:lineRule="auto"/>
+      </w:pPr>
+      <w:r>
+        <w:rPr>
+          <w:rFonts w:ascii="Times New Roman" w:hAnsi="Times New Roman"/>
+          <w:b w:val="0"/>
+          <w:i w:val="0"/>
+          <w:sz w:val="20"/>
+        </w:rPr>
+        <w:t>IGN / CNIG. Modelo Digital de Pendientes MDP05, CC-BY 4.0. https://centrodedescargas.cnig.es/CentroDescargas/modelo-digital-pendientes-mdp05-primera-cobertura</w:t>
+      </w:r>
+    </w:p>
+    <w:p>
+      <w:pPr>
+        <w:spacing w:after="80" w:line="276" w:lineRule="auto"/>
+      </w:pPr>
+      <w:r>
+        <w:rPr>
+          <w:rFonts w:ascii="Times New Roman" w:hAnsi="Times New Roman"/>
+          <w:b w:val="0"/>
+          <w:i w:val="0"/>
+          <w:sz w:val="20"/>
+        </w:rPr>
+        <w:t>Govern de les Illes Balears. Estacions de mesura de la qualitat de l'aire (CC-BY). https://intranet.caib.es/opendatacataleg/es/dataset/estacions-qualitat-aire</w:t>
+      </w:r>
+    </w:p>
+    <w:p>
+      <w:pPr>
+        <w:spacing w:after="80" w:line="276" w:lineRule="auto"/>
+      </w:pPr>
+      <w:r>
+        <w:rPr>
+          <w:rFonts w:ascii="Times New Roman" w:hAnsi="Times New Roman"/>
+          <w:b w:val="0"/>
+          <w:i w:val="0"/>
+          <w:sz w:val="20"/>
+        </w:rPr>
+        <w:t>AEMET. AEMET OpenData, observaciones meteorológicas. https://opendata.aemet.es</w:t>
+      </w:r>
+    </w:p>
+    <w:p>
+      <w:pPr>
+        <w:spacing w:after="80" w:line="276" w:lineRule="auto"/>
+      </w:pPr>
+      <w:r>
+        <w:rPr>
+          <w:rFonts w:ascii="Times New Roman" w:hAnsi="Times New Roman"/>
+          <w:b w:val="0"/>
+          <w:i w:val="0"/>
+          <w:sz w:val="20"/>
+        </w:rPr>
+        <w:t>Dirección General de Tráfico. Microdatos de accidentes con víctimas 2024 (CC-BY 4.0). https://datos.gob.es/es/catalogo/e00130502-ficheros-de-microdatos-de-accidentes-con-victimas-2024</w:t>
+      </w:r>
+    </w:p>
+    <w:p>
+      <w:pPr>
+        <w:spacing w:after="80" w:line="276" w:lineRule="auto"/>
+      </w:pPr>
+      <w:r>
+        <w:rPr>
+          <w:rFonts w:ascii="Times New Roman" w:hAnsi="Times New Roman"/>
+          <w:b w:val="0"/>
+          <w:i w:val="0"/>
+          <w:sz w:val="20"/>
+        </w:rPr>
+        <w:t>IBESTAT. Oferta turística reglada, serie 000060A_000004. https://ibestat.caib.es</w:t>
+      </w:r>
+    </w:p>
+    <w:p>
+      <w:pPr>
+        <w:spacing w:after="80" w:line="276" w:lineRule="auto"/>
+      </w:pPr>
+      <w:r>
+        <w:rPr>
+          <w:rFonts w:ascii="Times New Roman" w:hAnsi="Times New Roman"/>
+          <w:b w:val="0"/>
+          <w:i w:val="0"/>
+          <w:sz w:val="20"/>
+        </w:rPr>
+        <w:t>Inside Airbnb. Datos de Mallorca (CC BY 4.0). https://insideairbnb.com/get-the-data/</w:t>
+      </w:r>
+    </w:p>
+    <w:p>
+      <w:pPr>
+        <w:spacing w:after="80" w:line="276" w:lineRule="auto"/>
+      </w:pPr>
+      <w:r>
+        <w:rPr>
+          <w:rFonts w:ascii="Times New Roman" w:hAnsi="Times New Roman"/>
+          <w:b w:val="0"/>
+          <w:i w:val="0"/>
+          <w:sz w:val="20"/>
+        </w:rPr>
+        <w:t>nlptown. bert-base-multilingual-uncased-sentiment (licencia MIT). Hugging Face. https://huggingface.co/nlptown/bert-base-multilingual-uncased-sentiment</w:t>
+      </w:r>
+    </w:p>
+    <w:p>
+      <w:pPr>
+        <w:spacing w:after="80" w:line="276" w:lineRule="auto"/>
+      </w:pPr>
+      <w:r>
+        <w:rPr>
+          <w:rFonts w:ascii="Times New Roman" w:hAnsi="Times New Roman"/>
+          <w:b w:val="0"/>
+          <w:i w:val="0"/>
+          <w:sz w:val="20"/>
+        </w:rPr>
+        <w:t>Ester, M., Kriegel, H.-P., Sander, J. y Xu, X. (1996). A density-based algorithm for discovering clusters in large spatial databases with noise. Proceedings of KDD-96.</w:t>
+      </w:r>
+    </w:p>
+    <w:p>
+      <w:pPr>
+        <w:spacing w:after="80" w:line="276" w:lineRule="auto"/>
+      </w:pPr>
+      <w:r>
+        <w:rPr>
+          <w:rFonts w:ascii="Times New Roman" w:hAnsi="Times New Roman"/>
+          <w:b w:val="0"/>
+          <w:i w:val="0"/>
+          <w:sz w:val="20"/>
+        </w:rPr>
+        <w:t>MITECO (2024). Factores de emisión utilizados en el cálculo de impacto ambiental: 0,095 kg CO₂eq/km (coche) y 0,065 kg CO₂eq/km (autobús).</w:t>
+      </w:r>
+    </w:p>
+    <w:p>
+      <w:pPr>
+        <w:spacing w:after="80" w:line="276" w:lineRule="auto"/>
+      </w:pPr>
+      <w:r>
+        <w:rPr>
+          <w:rFonts w:ascii="Times New Roman" w:hAnsi="Times New Roman"/>
+          <w:b w:val="0"/>
+          <w:i w:val="0"/>
+          <w:sz w:val="20"/>
+        </w:rPr>
+        <w:t>Repositorio del proyecto. https://github.com/isaebelgt-sketch/TFM-movilidad-Mallorca</w:t>
       </w:r>
     </w:p>
     <w:p>

</xml_diff>